<commit_message>
Discusión final: Tabla 6 por bloques, universo 281/328 e hipótesis completada
Se eliminan las menciones a causales no codificadas (regla de Pleno,
calificación jurídica, pericia).

Co-Authored-By: Claude Opus 5.5 <noreply@anthropic.com>
Claude-Session: https://claude.ai/code/session_015AyYbx48wKJZQc75MGcDui
</commit_message>
<xml_diff>
--- a/Tabla6_por_bloques_actualizada.docx
+++ b/Tabla6_por_bloques_actualizada.docx
@@ -1595,6 +1595,188 @@
         <w:tc>
           <w:tcPr>
             <w:tcW w:type="dxa" w:w="4000"/>
+            <w:gridSpan w:val="1"/>
+            <w:tcBorders>
+              <w:top w:val="none" w:color="FFFFFF" w:sz="0"/>
+              <w:left w:val="none" w:color="FFFFFF" w:sz="0"/>
+              <w:bottom w:val="none" w:color="FFFFFF" w:sz="0"/>
+              <w:right w:val="none" w:color="FFFFFF" w:sz="0"/>
+            </w:tcBorders>
+            <w:tcMar>
+              <w:left w:type="dxa" w:w="60"/>
+              <w:right w:type="dxa" w:w="60"/>
+            </w:tcMar>
+          </w:tcPr>
+          <w:p>
+            <w:pPr>
+              <w:spacing w:after="20" w:before="20"/>
+              <w:jc w:val="left"/>
+            </w:pPr>
+            <w:r>
+              <w:rPr>
+                <w:rFonts w:ascii="Times New Roman" w:cs="Times New Roman" w:eastAsia="Times New Roman" w:hAnsi="Times New Roman"/>
+                <w:sz w:val="20"/>
+                <w:szCs w:val="20"/>
+              </w:rPr>
+              <w:t xml:space="preserve">d) Motivación insuficiente</w:t>
+            </w:r>
+          </w:p>
+        </w:tc>
+        <w:tc>
+          <w:tcPr>
+            <w:tcW w:type="dxa" w:w="900"/>
+            <w:gridSpan w:val="1"/>
+            <w:tcBorders>
+              <w:top w:val="none" w:color="FFFFFF" w:sz="0"/>
+              <w:left w:val="none" w:color="FFFFFF" w:sz="0"/>
+              <w:bottom w:val="none" w:color="FFFFFF" w:sz="0"/>
+              <w:right w:val="none" w:color="FFFFFF" w:sz="0"/>
+            </w:tcBorders>
+            <w:tcMar>
+              <w:left w:type="dxa" w:w="60"/>
+              <w:right w:type="dxa" w:w="60"/>
+            </w:tcMar>
+          </w:tcPr>
+          <w:p>
+            <w:pPr>
+              <w:spacing w:after="20" w:before="20"/>
+              <w:jc w:val="center"/>
+            </w:pPr>
+            <w:r>
+              <w:rPr>
+                <w:rFonts w:ascii="Times New Roman" w:cs="Times New Roman" w:eastAsia="Times New Roman" w:hAnsi="Times New Roman"/>
+                <w:sz w:val="20"/>
+                <w:szCs w:val="20"/>
+              </w:rPr>
+              <w:t xml:space="preserve">d)</w:t>
+            </w:r>
+          </w:p>
+        </w:tc>
+        <w:tc>
+          <w:tcPr>
+            <w:tcW w:type="dxa" w:w="1200"/>
+            <w:gridSpan w:val="1"/>
+            <w:tcBorders>
+              <w:top w:val="none" w:color="FFFFFF" w:sz="0"/>
+              <w:left w:val="none" w:color="FFFFFF" w:sz="0"/>
+              <w:bottom w:val="none" w:color="FFFFFF" w:sz="0"/>
+              <w:right w:val="none" w:color="FFFFFF" w:sz="0"/>
+            </w:tcBorders>
+            <w:tcMar>
+              <w:left w:type="dxa" w:w="60"/>
+              <w:right w:type="dxa" w:w="60"/>
+            </w:tcMar>
+          </w:tcPr>
+          <w:p>
+            <w:pPr>
+              <w:spacing w:after="20" w:before="20"/>
+              <w:jc w:val="center"/>
+            </w:pPr>
+            <w:r>
+              <w:rPr>
+                <w:rFonts w:ascii="Times New Roman" w:cs="Times New Roman" w:eastAsia="Times New Roman" w:hAnsi="Times New Roman"/>
+                <w:sz w:val="20"/>
+                <w:szCs w:val="20"/>
+              </w:rPr>
+              <w:t>9</w:t>
+            </w:r>
+          </w:p>
+        </w:tc>
+        <w:tc>
+          <w:tcPr>
+            <w:tcW w:type="dxa" w:w="800"/>
+            <w:gridSpan w:val="1"/>
+            <w:tcBorders>
+              <w:top w:val="none" w:color="FFFFFF" w:sz="0"/>
+              <w:left w:val="none" w:color="FFFFFF" w:sz="0"/>
+              <w:bottom w:val="none" w:color="FFFFFF" w:sz="0"/>
+              <w:right w:val="none" w:color="FFFFFF" w:sz="0"/>
+            </w:tcBorders>
+            <w:tcMar>
+              <w:left w:type="dxa" w:w="60"/>
+              <w:right w:type="dxa" w:w="60"/>
+            </w:tcMar>
+          </w:tcPr>
+          <w:p>
+            <w:pPr>
+              <w:spacing w:after="20" w:before="20"/>
+              <w:jc w:val="center"/>
+            </w:pPr>
+            <w:r>
+              <w:rPr>
+                <w:rFonts w:ascii="Times New Roman" w:cs="Times New Roman" w:eastAsia="Times New Roman" w:hAnsi="Times New Roman"/>
+                <w:sz w:val="20"/>
+                <w:szCs w:val="20"/>
+              </w:rPr>
+              <w:t>17,0</w:t>
+            </w:r>
+          </w:p>
+        </w:tc>
+        <w:tc>
+          <w:tcPr>
+            <w:tcW w:type="dxa" w:w="1100"/>
+            <w:gridSpan w:val="1"/>
+            <w:tcBorders>
+              <w:top w:val="none" w:color="FFFFFF" w:sz="0"/>
+              <w:left w:val="none" w:color="FFFFFF" w:sz="0"/>
+              <w:bottom w:val="none" w:color="FFFFFF" w:sz="0"/>
+              <w:right w:val="none" w:color="FFFFFF" w:sz="0"/>
+            </w:tcBorders>
+            <w:tcMar>
+              <w:left w:type="dxa" w:w="60"/>
+              <w:right w:type="dxa" w:w="60"/>
+            </w:tcMar>
+          </w:tcPr>
+          <w:p>
+            <w:pPr>
+              <w:spacing w:after="20" w:before="20"/>
+              <w:jc w:val="center"/>
+            </w:pPr>
+            <w:r>
+              <w:rPr>
+                <w:rFonts w:ascii="Times New Roman" w:cs="Times New Roman" w:eastAsia="Times New Roman" w:hAnsi="Times New Roman"/>
+                <w:sz w:val="20"/>
+                <w:szCs w:val="20"/>
+              </w:rPr>
+              <w:t>10</w:t>
+            </w:r>
+          </w:p>
+        </w:tc>
+        <w:tc>
+          <w:tcPr>
+            <w:tcW w:type="dxa" w:w="800"/>
+            <w:gridSpan w:val="1"/>
+            <w:tcBorders>
+              <w:top w:val="none" w:color="FFFFFF" w:sz="0"/>
+              <w:left w:val="none" w:color="FFFFFF" w:sz="0"/>
+              <w:bottom w:val="none" w:color="FFFFFF" w:sz="0"/>
+              <w:right w:val="none" w:color="FFFFFF" w:sz="0"/>
+            </w:tcBorders>
+            <w:tcMar>
+              <w:left w:type="dxa" w:w="60"/>
+              <w:right w:type="dxa" w:w="60"/>
+            </w:tcMar>
+          </w:tcPr>
+          <w:p>
+            <w:pPr>
+              <w:spacing w:after="20" w:before="20"/>
+              <w:jc w:val="center"/>
+            </w:pPr>
+            <w:r>
+              <w:rPr>
+                <w:rFonts w:ascii="Times New Roman" w:cs="Times New Roman" w:eastAsia="Times New Roman" w:hAnsi="Times New Roman"/>
+                <w:sz w:val="20"/>
+                <w:szCs w:val="20"/>
+              </w:rPr>
+              <w:t>19,2</w:t>
+            </w:r>
+          </w:p>
+        </w:tc>
+      </w:tr>
+      <w:tr>
+        <w:tc>
+          <w:tcPr>
+            <w:tcW w:type="dxa" w:w="4000"/>
             <w:tcBorders>
               <w:top w:val="none" w:color="FFFFFF" w:sz="0"/>
               <w:left w:val="none" w:color="FFFFFF" w:sz="0"/>
@@ -1619,7 +1801,7 @@
                 <w:sz w:val="20"/>
                 <w:szCs w:val="20"/>
               </w:rPr>
-              <w:t xml:space="preserve">de ello: omisión de regla vinculante de Pleno Casatorio</w:t>
+              <w:t xml:space="preserve">de ello: omisión de valoración de prueba admitida o decisiva</w:t>
             </w:r>
           </w:p>
         </w:tc>
@@ -1650,7 +1832,7 @@
                 <w:sz w:val="20"/>
                 <w:szCs w:val="20"/>
               </w:rPr>
-              <w:t xml:space="preserve">c)</w:t>
+              <w:t>d) / D11</w:t>
             </w:r>
           </w:p>
         </w:tc>
@@ -1681,7 +1863,7 @@
                 <w:sz w:val="20"/>
                 <w:szCs w:val="20"/>
               </w:rPr>
-              <w:t>n. c.</w:t>
+              <w:t>0</w:t>
             </w:r>
           </w:p>
         </w:tc>
@@ -1712,7 +1894,7 @@
                 <w:sz w:val="20"/>
                 <w:szCs w:val="20"/>
               </w:rPr>
-              <w:t>—</w:t>
+              <w:t>0,0</w:t>
             </w:r>
           </w:p>
         </w:tc>
@@ -1743,7 +1925,7 @@
                 <w:sz w:val="20"/>
                 <w:szCs w:val="20"/>
               </w:rPr>
-              <w:t>n. c.</w:t>
+              <w:t>3</w:t>
             </w:r>
           </w:p>
         </w:tc>
@@ -1774,7 +1956,7 @@
                 <w:sz w:val="20"/>
                 <w:szCs w:val="20"/>
               </w:rPr>
-              <w:t>—</w:t>
+              <w:t>5,8</w:t>
             </w:r>
           </w:p>
         </w:tc>
@@ -1806,7 +1988,7 @@
                 <w:sz w:val="20"/>
                 <w:szCs w:val="20"/>
               </w:rPr>
-              <w:t xml:space="preserve">d) Motivación insuficiente</w:t>
+              <w:t xml:space="preserve">e) Motivación sustancialmente incongruente</w:t>
             </w:r>
           </w:p>
         </w:tc>
@@ -1836,7 +2018,7 @@
                 <w:sz w:val="20"/>
                 <w:szCs w:val="20"/>
               </w:rPr>
-              <w:t xml:space="preserve">d)</w:t>
+              <w:t xml:space="preserve">e)</w:t>
             </w:r>
           </w:p>
         </w:tc>
@@ -1866,7 +2048,7 @@
                 <w:sz w:val="20"/>
                 <w:szCs w:val="20"/>
               </w:rPr>
-              <w:t>9</w:t>
+              <w:t>11</w:t>
             </w:r>
           </w:p>
         </w:tc>
@@ -1896,7 +2078,7 @@
                 <w:sz w:val="20"/>
                 <w:szCs w:val="20"/>
               </w:rPr>
-              <w:t>17,0</w:t>
+              <w:t>20,8</w:t>
             </w:r>
           </w:p>
         </w:tc>
@@ -1926,7 +2108,7 @@
                 <w:sz w:val="20"/>
                 <w:szCs w:val="20"/>
               </w:rPr>
-              <w:t>10</w:t>
+              <w:t>6</w:t>
             </w:r>
           </w:p>
         </w:tc>
@@ -1956,7 +2138,7 @@
                 <w:sz w:val="20"/>
                 <w:szCs w:val="20"/>
               </w:rPr>
-              <w:t>19,2</w:t>
+              <w:t>11,5</w:t>
             </w:r>
           </w:p>
         </w:tc>
@@ -1989,7 +2171,7 @@
                 <w:sz w:val="20"/>
                 <w:szCs w:val="20"/>
               </w:rPr>
-              <w:t xml:space="preserve">de ello: omisión de valoración de prueba admitida o decisiva</w:t>
+              <w:t xml:space="preserve">de ello: incongruencia ultra, extra o citra petita</w:t>
             </w:r>
           </w:p>
         </w:tc>
@@ -2020,7 +2202,7 @@
                 <w:sz w:val="20"/>
                 <w:szCs w:val="20"/>
               </w:rPr>
-              <w:t>d) / D11</w:t>
+              <w:t>e) / D16</w:t>
             </w:r>
           </w:p>
         </w:tc>
@@ -2051,7 +2233,7 @@
                 <w:sz w:val="20"/>
                 <w:szCs w:val="20"/>
               </w:rPr>
-              <w:t>0</w:t>
+              <w:t>9</w:t>
             </w:r>
           </w:p>
         </w:tc>
@@ -2082,7 +2264,7 @@
                 <w:sz w:val="20"/>
                 <w:szCs w:val="20"/>
               </w:rPr>
-              <w:t>0,0</w:t>
+              <w:t>17,0</w:t>
             </w:r>
           </w:p>
         </w:tc>
@@ -2113,7 +2295,7 @@
                 <w:sz w:val="20"/>
                 <w:szCs w:val="20"/>
               </w:rPr>
-              <w:t>3</w:t>
+              <w:t>6</w:t>
             </w:r>
           </w:p>
         </w:tc>
@@ -2144,7 +2326,7 @@
                 <w:sz w:val="20"/>
                 <w:szCs w:val="20"/>
               </w:rPr>
-              <w:t>5,8</w:t>
+              <w:t>11,5</w:t>
             </w:r>
           </w:p>
         </w:tc>
@@ -2176,7 +2358,7 @@
                 <w:sz w:val="20"/>
                 <w:szCs w:val="20"/>
               </w:rPr>
-              <w:t xml:space="preserve">e) Motivación sustancialmente incongruente</w:t>
+              <w:t xml:space="preserve">f) Motivación cualificada</w:t>
             </w:r>
           </w:p>
         </w:tc>
@@ -2206,7 +2388,7 @@
                 <w:sz w:val="20"/>
                 <w:szCs w:val="20"/>
               </w:rPr>
-              <w:t xml:space="preserve">e)</w:t>
+              <w:t xml:space="preserve">f)</w:t>
             </w:r>
           </w:p>
         </w:tc>
@@ -2236,7 +2418,7 @@
                 <w:sz w:val="20"/>
                 <w:szCs w:val="20"/>
               </w:rPr>
-              <w:t>11</w:t>
+              <w:t>0</w:t>
             </w:r>
           </w:p>
         </w:tc>
@@ -2266,7 +2448,7 @@
                 <w:sz w:val="20"/>
                 <w:szCs w:val="20"/>
               </w:rPr>
-              <w:t>20,8</w:t>
+              <w:t>0,0</w:t>
             </w:r>
           </w:p>
         </w:tc>
@@ -2296,7 +2478,7 @@
                 <w:sz w:val="20"/>
                 <w:szCs w:val="20"/>
               </w:rPr>
-              <w:t>6</w:t>
+              <w:t>0</w:t>
             </w:r>
           </w:p>
         </w:tc>
@@ -2326,7 +2508,7 @@
                 <w:sz w:val="20"/>
                 <w:szCs w:val="20"/>
               </w:rPr>
-              <w:t>11,5</w:t>
+              <w:t>0,0</w:t>
             </w:r>
           </w:p>
         </w:tc>
@@ -2334,15 +2516,16 @@
       <w:tr>
         <w:tc>
           <w:tcPr>
-            <w:tcW w:type="dxa" w:w="4000"/>
-            <w:tcBorders>
-              <w:top w:val="none" w:color="FFFFFF" w:sz="0"/>
-              <w:left w:val="none" w:color="FFFFFF" w:sz="0"/>
-              <w:bottom w:val="none" w:color="FFFFFF" w:sz="0"/>
-              <w:right w:val="none" w:color="FFFFFF" w:sz="0"/>
-            </w:tcBorders>
-            <w:tcMar>
-              <w:left w:type="dxa" w:w="360"/>
+            <w:tcW w:type="dxa" w:w="8800"/>
+            <w:gridSpan w:val="6"/>
+            <w:tcBorders>
+              <w:top w:val="none" w:color="FFFFFF" w:sz="0"/>
+              <w:left w:val="none" w:color="FFFFFF" w:sz="0"/>
+              <w:bottom w:val="none" w:color="FFFFFF" w:sz="0"/>
+              <w:right w:val="none" w:color="FFFFFF" w:sz="0"/>
+            </w:tcBorders>
+            <w:tcMar>
+              <w:left w:type="dxa" w:w="60"/>
               <w:right w:type="dxa" w:w="60"/>
             </w:tcMar>
           </w:tcPr>
@@ -2354,167 +2537,12 @@
             <w:r>
               <w:rPr>
                 <w:rFonts w:ascii="Times New Roman" w:cs="Times New Roman" w:eastAsia="Times New Roman" w:hAnsi="Times New Roman"/>
-                <w:i/>
-                <w:iCs/>
-                <w:sz w:val="20"/>
-                <w:szCs w:val="20"/>
-              </w:rPr>
-              <w:t xml:space="preserve">de ello: incongruencia ultra, extra o citra petita</w:t>
-            </w:r>
-          </w:p>
-        </w:tc>
-        <w:tc>
-          <w:tcPr>
-            <w:tcW w:type="dxa" w:w="900"/>
-            <w:tcBorders>
-              <w:top w:val="none" w:color="FFFFFF" w:sz="0"/>
-              <w:left w:val="none" w:color="FFFFFF" w:sz="0"/>
-              <w:bottom w:val="none" w:color="FFFFFF" w:sz="0"/>
-              <w:right w:val="none" w:color="FFFFFF" w:sz="0"/>
-            </w:tcBorders>
-            <w:tcMar>
-              <w:left w:type="dxa" w:w="60"/>
-              <w:right w:type="dxa" w:w="60"/>
-            </w:tcMar>
-          </w:tcPr>
-          <w:p>
-            <w:pPr>
-              <w:spacing w:after="20" w:before="20"/>
-              <w:jc w:val="center"/>
-            </w:pPr>
-            <w:r>
-              <w:rPr>
-                <w:rFonts w:ascii="Times New Roman" w:cs="Times New Roman" w:eastAsia="Times New Roman" w:hAnsi="Times New Roman"/>
-                <w:i w:val="false"/>
-                <w:iCs w:val="false"/>
-                <w:sz w:val="20"/>
-                <w:szCs w:val="20"/>
-              </w:rPr>
-              <w:t>e) / D16</w:t>
-            </w:r>
-          </w:p>
-        </w:tc>
-        <w:tc>
-          <w:tcPr>
-            <w:tcW w:type="dxa" w:w="1200"/>
-            <w:tcBorders>
-              <w:top w:val="none" w:color="FFFFFF" w:sz="0"/>
-              <w:left w:val="none" w:color="FFFFFF" w:sz="0"/>
-              <w:bottom w:val="none" w:color="FFFFFF" w:sz="0"/>
-              <w:right w:val="none" w:color="FFFFFF" w:sz="0"/>
-            </w:tcBorders>
-            <w:tcMar>
-              <w:left w:type="dxa" w:w="60"/>
-              <w:right w:type="dxa" w:w="60"/>
-            </w:tcMar>
-          </w:tcPr>
-          <w:p>
-            <w:pPr>
-              <w:spacing w:after="20" w:before="20"/>
-              <w:jc w:val="center"/>
-            </w:pPr>
-            <w:r>
-              <w:rPr>
-                <w:rFonts w:ascii="Times New Roman" w:cs="Times New Roman" w:eastAsia="Times New Roman" w:hAnsi="Times New Roman"/>
-                <w:i w:val="false"/>
-                <w:iCs w:val="false"/>
-                <w:sz w:val="20"/>
-                <w:szCs w:val="20"/>
-              </w:rPr>
-              <w:t>9</w:t>
-            </w:r>
-          </w:p>
-        </w:tc>
-        <w:tc>
-          <w:tcPr>
-            <w:tcW w:type="dxa" w:w="800"/>
-            <w:tcBorders>
-              <w:top w:val="none" w:color="FFFFFF" w:sz="0"/>
-              <w:left w:val="none" w:color="FFFFFF" w:sz="0"/>
-              <w:bottom w:val="none" w:color="FFFFFF" w:sz="0"/>
-              <w:right w:val="none" w:color="FFFFFF" w:sz="0"/>
-            </w:tcBorders>
-            <w:tcMar>
-              <w:left w:type="dxa" w:w="60"/>
-              <w:right w:type="dxa" w:w="60"/>
-            </w:tcMar>
-          </w:tcPr>
-          <w:p>
-            <w:pPr>
-              <w:spacing w:after="20" w:before="20"/>
-              <w:jc w:val="center"/>
-            </w:pPr>
-            <w:r>
-              <w:rPr>
-                <w:rFonts w:ascii="Times New Roman" w:cs="Times New Roman" w:eastAsia="Times New Roman" w:hAnsi="Times New Roman"/>
-                <w:i w:val="false"/>
-                <w:iCs w:val="false"/>
-                <w:sz w:val="20"/>
-                <w:szCs w:val="20"/>
-              </w:rPr>
-              <w:t>17,0</w:t>
-            </w:r>
-          </w:p>
-        </w:tc>
-        <w:tc>
-          <w:tcPr>
-            <w:tcW w:type="dxa" w:w="1100"/>
-            <w:tcBorders>
-              <w:top w:val="none" w:color="FFFFFF" w:sz="0"/>
-              <w:left w:val="none" w:color="FFFFFF" w:sz="0"/>
-              <w:bottom w:val="none" w:color="FFFFFF" w:sz="0"/>
-              <w:right w:val="none" w:color="FFFFFF" w:sz="0"/>
-            </w:tcBorders>
-            <w:tcMar>
-              <w:left w:type="dxa" w:w="60"/>
-              <w:right w:type="dxa" w:w="60"/>
-            </w:tcMar>
-          </w:tcPr>
-          <w:p>
-            <w:pPr>
-              <w:spacing w:after="20" w:before="20"/>
-              <w:jc w:val="center"/>
-            </w:pPr>
-            <w:r>
-              <w:rPr>
-                <w:rFonts w:ascii="Times New Roman" w:cs="Times New Roman" w:eastAsia="Times New Roman" w:hAnsi="Times New Roman"/>
-                <w:i w:val="false"/>
-                <w:iCs w:val="false"/>
-                <w:sz w:val="20"/>
-                <w:szCs w:val="20"/>
-              </w:rPr>
-              <w:t>6</w:t>
-            </w:r>
-          </w:p>
-        </w:tc>
-        <w:tc>
-          <w:tcPr>
-            <w:tcW w:type="dxa" w:w="800"/>
-            <w:tcBorders>
-              <w:top w:val="none" w:color="FFFFFF" w:sz="0"/>
-              <w:left w:val="none" w:color="FFFFFF" w:sz="0"/>
-              <w:bottom w:val="none" w:color="FFFFFF" w:sz="0"/>
-              <w:right w:val="none" w:color="FFFFFF" w:sz="0"/>
-            </w:tcBorders>
-            <w:tcMar>
-              <w:left w:type="dxa" w:w="60"/>
-              <w:right w:type="dxa" w:w="60"/>
-            </w:tcMar>
-          </w:tcPr>
-          <w:p>
-            <w:pPr>
-              <w:spacing w:after="20" w:before="20"/>
-              <w:jc w:val="center"/>
-            </w:pPr>
-            <w:r>
-              <w:rPr>
-                <w:rFonts w:ascii="Times New Roman" w:cs="Times New Roman" w:eastAsia="Times New Roman" w:hAnsi="Times New Roman"/>
-                <w:i w:val="false"/>
-                <w:iCs w:val="false"/>
-                <w:sz w:val="20"/>
-                <w:szCs w:val="20"/>
-              </w:rPr>
-              <w:t>11,5</w:t>
+                <w:b/>
+                <w:bCs/>
+                <w:sz w:val="20"/>
+                <w:szCs w:val="20"/>
+              </w:rPr>
+              <w:t xml:space="preserve">III. Errores in iudicando (revocación)</w:t>
             </w:r>
           </w:p>
         </w:tc>
@@ -2546,7 +2574,7 @@
                 <w:sz w:val="20"/>
                 <w:szCs w:val="20"/>
               </w:rPr>
-              <w:t xml:space="preserve">f) Motivación cualificada</w:t>
+              <w:t xml:space="preserve">Error en la valoración probatoria que cambia el fallo</w:t>
             </w:r>
           </w:p>
         </w:tc>
@@ -2576,7 +2604,7 @@
                 <w:sz w:val="20"/>
                 <w:szCs w:val="20"/>
               </w:rPr>
-              <w:t xml:space="preserve">f)</w:t>
+              <w:t>D12</w:t>
             </w:r>
           </w:p>
         </w:tc>
@@ -2606,7 +2634,7 @@
                 <w:sz w:val="20"/>
                 <w:szCs w:val="20"/>
               </w:rPr>
-              <w:t>0</w:t>
+              <w:t>8</w:t>
             </w:r>
           </w:p>
         </w:tc>
@@ -2636,7 +2664,7 @@
                 <w:sz w:val="20"/>
                 <w:szCs w:val="20"/>
               </w:rPr>
-              <w:t>0,0</w:t>
+              <w:t>15,1</w:t>
             </w:r>
           </w:p>
         </w:tc>
@@ -2666,7 +2694,7 @@
                 <w:sz w:val="20"/>
                 <w:szCs w:val="20"/>
               </w:rPr>
-              <w:t>0</w:t>
+              <w:t>10</w:t>
             </w:r>
           </w:p>
         </w:tc>
@@ -2696,587 +2724,7 @@
                 <w:sz w:val="20"/>
                 <w:szCs w:val="20"/>
               </w:rPr>
-              <w:t>0,0</w:t>
-            </w:r>
-          </w:p>
-        </w:tc>
-      </w:tr>
-      <w:tr>
-        <w:tc>
-          <w:tcPr>
-            <w:tcW w:type="dxa" w:w="8800"/>
-            <w:gridSpan w:val="6"/>
-            <w:tcBorders>
-              <w:top w:val="none" w:color="FFFFFF" w:sz="0"/>
-              <w:left w:val="none" w:color="FFFFFF" w:sz="0"/>
-              <w:bottom w:val="none" w:color="FFFFFF" w:sz="0"/>
-              <w:right w:val="none" w:color="FFFFFF" w:sz="0"/>
-            </w:tcBorders>
-            <w:tcMar>
-              <w:left w:type="dxa" w:w="60"/>
-              <w:right w:type="dxa" w:w="60"/>
-            </w:tcMar>
-          </w:tcPr>
-          <w:p>
-            <w:pPr>
-              <w:spacing w:after="20" w:before="20"/>
-              <w:jc w:val="left"/>
-            </w:pPr>
-            <w:r>
-              <w:rPr>
-                <w:rFonts w:ascii="Times New Roman" w:cs="Times New Roman" w:eastAsia="Times New Roman" w:hAnsi="Times New Roman"/>
-                <w:b/>
-                <w:bCs/>
-                <w:sz w:val="20"/>
-                <w:szCs w:val="20"/>
-              </w:rPr>
-              <w:t xml:space="preserve">III. Errores in iudicando (revocación)</w:t>
-            </w:r>
-          </w:p>
-        </w:tc>
-      </w:tr>
-      <w:tr>
-        <w:tc>
-          <w:tcPr>
-            <w:tcW w:type="dxa" w:w="4000"/>
-            <w:gridSpan w:val="1"/>
-            <w:tcBorders>
-              <w:top w:val="none" w:color="FFFFFF" w:sz="0"/>
-              <w:left w:val="none" w:color="FFFFFF" w:sz="0"/>
-              <w:bottom w:val="none" w:color="FFFFFF" w:sz="0"/>
-              <w:right w:val="none" w:color="FFFFFF" w:sz="0"/>
-            </w:tcBorders>
-            <w:tcMar>
-              <w:left w:type="dxa" w:w="60"/>
-              <w:right w:type="dxa" w:w="60"/>
-            </w:tcMar>
-          </w:tcPr>
-          <w:p>
-            <w:pPr>
-              <w:spacing w:after="20" w:before="20"/>
-              <w:jc w:val="left"/>
-            </w:pPr>
-            <w:r>
-              <w:rPr>
-                <w:rFonts w:ascii="Times New Roman" w:cs="Times New Roman" w:eastAsia="Times New Roman" w:hAnsi="Times New Roman"/>
-                <w:sz w:val="20"/>
-                <w:szCs w:val="20"/>
-              </w:rPr>
-              <w:t xml:space="preserve">Error en la calificación jurídica</w:t>
-            </w:r>
-          </w:p>
-        </w:tc>
-        <w:tc>
-          <w:tcPr>
-            <w:tcW w:type="dxa" w:w="900"/>
-            <w:gridSpan w:val="1"/>
-            <w:tcBorders>
-              <w:top w:val="none" w:color="FFFFFF" w:sz="0"/>
-              <w:left w:val="none" w:color="FFFFFF" w:sz="0"/>
-              <w:bottom w:val="none" w:color="FFFFFF" w:sz="0"/>
-              <w:right w:val="none" w:color="FFFFFF" w:sz="0"/>
-            </w:tcBorders>
-            <w:tcMar>
-              <w:left w:type="dxa" w:w="60"/>
-              <w:right w:type="dxa" w:w="60"/>
-            </w:tcMar>
-          </w:tcPr>
-          <w:p>
-            <w:pPr>
-              <w:spacing w:after="20" w:before="20"/>
-              <w:jc w:val="center"/>
-            </w:pPr>
-            <w:r>
-              <w:rPr>
-                <w:rFonts w:ascii="Times New Roman" w:cs="Times New Roman" w:eastAsia="Times New Roman" w:hAnsi="Times New Roman"/>
-                <w:sz w:val="20"/>
-                <w:szCs w:val="20"/>
-              </w:rPr>
-              <w:t xml:space="preserve">—</w:t>
-            </w:r>
-          </w:p>
-        </w:tc>
-        <w:tc>
-          <w:tcPr>
-            <w:tcW w:type="dxa" w:w="1200"/>
-            <w:gridSpan w:val="1"/>
-            <w:tcBorders>
-              <w:top w:val="none" w:color="FFFFFF" w:sz="0"/>
-              <w:left w:val="none" w:color="FFFFFF" w:sz="0"/>
-              <w:bottom w:val="none" w:color="FFFFFF" w:sz="0"/>
-              <w:right w:val="none" w:color="FFFFFF" w:sz="0"/>
-            </w:tcBorders>
-            <w:tcMar>
-              <w:left w:type="dxa" w:w="60"/>
-              <w:right w:type="dxa" w:w="60"/>
-            </w:tcMar>
-          </w:tcPr>
-          <w:p>
-            <w:pPr>
-              <w:spacing w:after="20" w:before="20"/>
-              <w:jc w:val="center"/>
-            </w:pPr>
-            <w:r>
-              <w:rPr>
-                <w:rFonts w:ascii="Times New Roman" w:cs="Times New Roman" w:eastAsia="Times New Roman" w:hAnsi="Times New Roman"/>
-                <w:sz w:val="20"/>
-                <w:szCs w:val="20"/>
-              </w:rPr>
-              <w:t>n. c.</w:t>
-            </w:r>
-          </w:p>
-        </w:tc>
-        <w:tc>
-          <w:tcPr>
-            <w:tcW w:type="dxa" w:w="800"/>
-            <w:gridSpan w:val="1"/>
-            <w:tcBorders>
-              <w:top w:val="none" w:color="FFFFFF" w:sz="0"/>
-              <w:left w:val="none" w:color="FFFFFF" w:sz="0"/>
-              <w:bottom w:val="none" w:color="FFFFFF" w:sz="0"/>
-              <w:right w:val="none" w:color="FFFFFF" w:sz="0"/>
-            </w:tcBorders>
-            <w:tcMar>
-              <w:left w:type="dxa" w:w="60"/>
-              <w:right w:type="dxa" w:w="60"/>
-            </w:tcMar>
-          </w:tcPr>
-          <w:p>
-            <w:pPr>
-              <w:spacing w:after="20" w:before="20"/>
-              <w:jc w:val="center"/>
-            </w:pPr>
-            <w:r>
-              <w:rPr>
-                <w:rFonts w:ascii="Times New Roman" w:cs="Times New Roman" w:eastAsia="Times New Roman" w:hAnsi="Times New Roman"/>
-                <w:sz w:val="20"/>
-                <w:szCs w:val="20"/>
-              </w:rPr>
-              <w:t>—</w:t>
-            </w:r>
-          </w:p>
-        </w:tc>
-        <w:tc>
-          <w:tcPr>
-            <w:tcW w:type="dxa" w:w="1100"/>
-            <w:gridSpan w:val="1"/>
-            <w:tcBorders>
-              <w:top w:val="none" w:color="FFFFFF" w:sz="0"/>
-              <w:left w:val="none" w:color="FFFFFF" w:sz="0"/>
-              <w:bottom w:val="none" w:color="FFFFFF" w:sz="0"/>
-              <w:right w:val="none" w:color="FFFFFF" w:sz="0"/>
-            </w:tcBorders>
-            <w:tcMar>
-              <w:left w:type="dxa" w:w="60"/>
-              <w:right w:type="dxa" w:w="60"/>
-            </w:tcMar>
-          </w:tcPr>
-          <w:p>
-            <w:pPr>
-              <w:spacing w:after="20" w:before="20"/>
-              <w:jc w:val="center"/>
-            </w:pPr>
-            <w:r>
-              <w:rPr>
-                <w:rFonts w:ascii="Times New Roman" w:cs="Times New Roman" w:eastAsia="Times New Roman" w:hAnsi="Times New Roman"/>
-                <w:sz w:val="20"/>
-                <w:szCs w:val="20"/>
-              </w:rPr>
-              <w:t>n. c.</w:t>
-            </w:r>
-          </w:p>
-        </w:tc>
-        <w:tc>
-          <w:tcPr>
-            <w:tcW w:type="dxa" w:w="800"/>
-            <w:gridSpan w:val="1"/>
-            <w:tcBorders>
-              <w:top w:val="none" w:color="FFFFFF" w:sz="0"/>
-              <w:left w:val="none" w:color="FFFFFF" w:sz="0"/>
-              <w:bottom w:val="none" w:color="FFFFFF" w:sz="0"/>
-              <w:right w:val="none" w:color="FFFFFF" w:sz="0"/>
-            </w:tcBorders>
-            <w:tcMar>
-              <w:left w:type="dxa" w:w="60"/>
-              <w:right w:type="dxa" w:w="60"/>
-            </w:tcMar>
-          </w:tcPr>
-          <w:p>
-            <w:pPr>
-              <w:spacing w:after="20" w:before="20"/>
-              <w:jc w:val="center"/>
-            </w:pPr>
-            <w:r>
-              <w:rPr>
-                <w:rFonts w:ascii="Times New Roman" w:cs="Times New Roman" w:eastAsia="Times New Roman" w:hAnsi="Times New Roman"/>
-                <w:sz w:val="20"/>
-                <w:szCs w:val="20"/>
-              </w:rPr>
-              <w:t>—</w:t>
-            </w:r>
-          </w:p>
-        </w:tc>
-      </w:tr>
-      <w:tr>
-        <w:tc>
-          <w:tcPr>
-            <w:tcW w:type="dxa" w:w="4000"/>
-            <w:gridSpan w:val="1"/>
-            <w:tcBorders>
-              <w:top w:val="none" w:color="FFFFFF" w:sz="0"/>
-              <w:left w:val="none" w:color="FFFFFF" w:sz="0"/>
-              <w:bottom w:val="none" w:color="FFFFFF" w:sz="0"/>
-              <w:right w:val="none" w:color="FFFFFF" w:sz="0"/>
-            </w:tcBorders>
-            <w:tcMar>
-              <w:left w:type="dxa" w:w="60"/>
-              <w:right w:type="dxa" w:w="60"/>
-            </w:tcMar>
-          </w:tcPr>
-          <w:p>
-            <w:pPr>
-              <w:spacing w:after="20" w:before="20"/>
-              <w:jc w:val="left"/>
-            </w:pPr>
-            <w:r>
-              <w:rPr>
-                <w:rFonts w:ascii="Times New Roman" w:cs="Times New Roman" w:eastAsia="Times New Roman" w:hAnsi="Times New Roman"/>
-                <w:sz w:val="20"/>
-                <w:szCs w:val="20"/>
-              </w:rPr>
-              <w:t xml:space="preserve">Error en la valoración probatoria que cambia el fallo</w:t>
-            </w:r>
-          </w:p>
-        </w:tc>
-        <w:tc>
-          <w:tcPr>
-            <w:tcW w:type="dxa" w:w="900"/>
-            <w:gridSpan w:val="1"/>
-            <w:tcBorders>
-              <w:top w:val="none" w:color="FFFFFF" w:sz="0"/>
-              <w:left w:val="none" w:color="FFFFFF" w:sz="0"/>
-              <w:bottom w:val="none" w:color="FFFFFF" w:sz="0"/>
-              <w:right w:val="none" w:color="FFFFFF" w:sz="0"/>
-            </w:tcBorders>
-            <w:tcMar>
-              <w:left w:type="dxa" w:w="60"/>
-              <w:right w:type="dxa" w:w="60"/>
-            </w:tcMar>
-          </w:tcPr>
-          <w:p>
-            <w:pPr>
-              <w:spacing w:after="20" w:before="20"/>
-              <w:jc w:val="center"/>
-            </w:pPr>
-            <w:r>
-              <w:rPr>
-                <w:rFonts w:ascii="Times New Roman" w:cs="Times New Roman" w:eastAsia="Times New Roman" w:hAnsi="Times New Roman"/>
-                <w:sz w:val="20"/>
-                <w:szCs w:val="20"/>
-              </w:rPr>
-              <w:t>D12</w:t>
-            </w:r>
-          </w:p>
-        </w:tc>
-        <w:tc>
-          <w:tcPr>
-            <w:tcW w:type="dxa" w:w="1200"/>
-            <w:gridSpan w:val="1"/>
-            <w:tcBorders>
-              <w:top w:val="none" w:color="FFFFFF" w:sz="0"/>
-              <w:left w:val="none" w:color="FFFFFF" w:sz="0"/>
-              <w:bottom w:val="none" w:color="FFFFFF" w:sz="0"/>
-              <w:right w:val="none" w:color="FFFFFF" w:sz="0"/>
-            </w:tcBorders>
-            <w:tcMar>
-              <w:left w:type="dxa" w:w="60"/>
-              <w:right w:type="dxa" w:w="60"/>
-            </w:tcMar>
-          </w:tcPr>
-          <w:p>
-            <w:pPr>
-              <w:spacing w:after="20" w:before="20"/>
-              <w:jc w:val="center"/>
-            </w:pPr>
-            <w:r>
-              <w:rPr>
-                <w:rFonts w:ascii="Times New Roman" w:cs="Times New Roman" w:eastAsia="Times New Roman" w:hAnsi="Times New Roman"/>
-                <w:sz w:val="20"/>
-                <w:szCs w:val="20"/>
-              </w:rPr>
-              <w:t>8</w:t>
-            </w:r>
-          </w:p>
-        </w:tc>
-        <w:tc>
-          <w:tcPr>
-            <w:tcW w:type="dxa" w:w="800"/>
-            <w:gridSpan w:val="1"/>
-            <w:tcBorders>
-              <w:top w:val="none" w:color="FFFFFF" w:sz="0"/>
-              <w:left w:val="none" w:color="FFFFFF" w:sz="0"/>
-              <w:bottom w:val="none" w:color="FFFFFF" w:sz="0"/>
-              <w:right w:val="none" w:color="FFFFFF" w:sz="0"/>
-            </w:tcBorders>
-            <w:tcMar>
-              <w:left w:type="dxa" w:w="60"/>
-              <w:right w:type="dxa" w:w="60"/>
-            </w:tcMar>
-          </w:tcPr>
-          <w:p>
-            <w:pPr>
-              <w:spacing w:after="20" w:before="20"/>
-              <w:jc w:val="center"/>
-            </w:pPr>
-            <w:r>
-              <w:rPr>
-                <w:rFonts w:ascii="Times New Roman" w:cs="Times New Roman" w:eastAsia="Times New Roman" w:hAnsi="Times New Roman"/>
-                <w:sz w:val="20"/>
-                <w:szCs w:val="20"/>
-              </w:rPr>
-              <w:t>15,1</w:t>
-            </w:r>
-          </w:p>
-        </w:tc>
-        <w:tc>
-          <w:tcPr>
-            <w:tcW w:type="dxa" w:w="1100"/>
-            <w:gridSpan w:val="1"/>
-            <w:tcBorders>
-              <w:top w:val="none" w:color="FFFFFF" w:sz="0"/>
-              <w:left w:val="none" w:color="FFFFFF" w:sz="0"/>
-              <w:bottom w:val="none" w:color="FFFFFF" w:sz="0"/>
-              <w:right w:val="none" w:color="FFFFFF" w:sz="0"/>
-            </w:tcBorders>
-            <w:tcMar>
-              <w:left w:type="dxa" w:w="60"/>
-              <w:right w:type="dxa" w:w="60"/>
-            </w:tcMar>
-          </w:tcPr>
-          <w:p>
-            <w:pPr>
-              <w:spacing w:after="20" w:before="20"/>
-              <w:jc w:val="center"/>
-            </w:pPr>
-            <w:r>
-              <w:rPr>
-                <w:rFonts w:ascii="Times New Roman" w:cs="Times New Roman" w:eastAsia="Times New Roman" w:hAnsi="Times New Roman"/>
-                <w:sz w:val="20"/>
-                <w:szCs w:val="20"/>
-              </w:rPr>
-              <w:t>10</w:t>
-            </w:r>
-          </w:p>
-        </w:tc>
-        <w:tc>
-          <w:tcPr>
-            <w:tcW w:type="dxa" w:w="800"/>
-            <w:gridSpan w:val="1"/>
-            <w:tcBorders>
-              <w:top w:val="none" w:color="FFFFFF" w:sz="0"/>
-              <w:left w:val="none" w:color="FFFFFF" w:sz="0"/>
-              <w:bottom w:val="none" w:color="FFFFFF" w:sz="0"/>
-              <w:right w:val="none" w:color="FFFFFF" w:sz="0"/>
-            </w:tcBorders>
-            <w:tcMar>
-              <w:left w:type="dxa" w:w="60"/>
-              <w:right w:type="dxa" w:w="60"/>
-            </w:tcMar>
-          </w:tcPr>
-          <w:p>
-            <w:pPr>
-              <w:spacing w:after="20" w:before="20"/>
-              <w:jc w:val="center"/>
-            </w:pPr>
-            <w:r>
-              <w:rPr>
-                <w:rFonts w:ascii="Times New Roman" w:cs="Times New Roman" w:eastAsia="Times New Roman" w:hAnsi="Times New Roman"/>
-                <w:sz w:val="20"/>
-                <w:szCs w:val="20"/>
-              </w:rPr>
               <w:t>19,2</w:t>
-            </w:r>
-          </w:p>
-        </w:tc>
-      </w:tr>
-      <w:tr>
-        <w:tc>
-          <w:tcPr>
-            <w:tcW w:type="dxa" w:w="4000"/>
-            <w:gridSpan w:val="1"/>
-            <w:tcBorders>
-              <w:top w:val="none" w:color="FFFFFF" w:sz="0"/>
-              <w:left w:val="none" w:color="FFFFFF" w:sz="0"/>
-              <w:bottom w:val="none" w:color="FFFFFF" w:sz="0"/>
-              <w:right w:val="none" w:color="FFFFFF" w:sz="0"/>
-            </w:tcBorders>
-            <w:tcMar>
-              <w:left w:type="dxa" w:w="60"/>
-              <w:right w:type="dxa" w:w="60"/>
-            </w:tcMar>
-          </w:tcPr>
-          <w:p>
-            <w:pPr>
-              <w:spacing w:after="20" w:before="20"/>
-              <w:jc w:val="left"/>
-            </w:pPr>
-            <w:r>
-              <w:rPr>
-                <w:rFonts w:ascii="Times New Roman" w:cs="Times New Roman" w:eastAsia="Times New Roman" w:hAnsi="Times New Roman"/>
-                <w:sz w:val="20"/>
-                <w:szCs w:val="20"/>
-              </w:rPr>
-              <w:t xml:space="preserve">Pericia imprecisa o valoración pericial deficiente</w:t>
-            </w:r>
-          </w:p>
-        </w:tc>
-        <w:tc>
-          <w:tcPr>
-            <w:tcW w:type="dxa" w:w="900"/>
-            <w:gridSpan w:val="1"/>
-            <w:tcBorders>
-              <w:top w:val="none" w:color="FFFFFF" w:sz="0"/>
-              <w:left w:val="none" w:color="FFFFFF" w:sz="0"/>
-              <w:bottom w:val="none" w:color="FFFFFF" w:sz="0"/>
-              <w:right w:val="none" w:color="FFFFFF" w:sz="0"/>
-            </w:tcBorders>
-            <w:tcMar>
-              <w:left w:type="dxa" w:w="60"/>
-              <w:right w:type="dxa" w:w="60"/>
-            </w:tcMar>
-          </w:tcPr>
-          <w:p>
-            <w:pPr>
-              <w:spacing w:after="20" w:before="20"/>
-              <w:jc w:val="center"/>
-            </w:pPr>
-            <w:r>
-              <w:rPr>
-                <w:rFonts w:ascii="Times New Roman" w:cs="Times New Roman" w:eastAsia="Times New Roman" w:hAnsi="Times New Roman"/>
-                <w:sz w:val="20"/>
-                <w:szCs w:val="20"/>
-              </w:rPr>
-              <w:t xml:space="preserve">—</w:t>
-            </w:r>
-          </w:p>
-        </w:tc>
-        <w:tc>
-          <w:tcPr>
-            <w:tcW w:type="dxa" w:w="1200"/>
-            <w:gridSpan w:val="1"/>
-            <w:tcBorders>
-              <w:top w:val="none" w:color="FFFFFF" w:sz="0"/>
-              <w:left w:val="none" w:color="FFFFFF" w:sz="0"/>
-              <w:bottom w:val="none" w:color="FFFFFF" w:sz="0"/>
-              <w:right w:val="none" w:color="FFFFFF" w:sz="0"/>
-            </w:tcBorders>
-            <w:tcMar>
-              <w:left w:type="dxa" w:w="60"/>
-              <w:right w:type="dxa" w:w="60"/>
-            </w:tcMar>
-          </w:tcPr>
-          <w:p>
-            <w:pPr>
-              <w:spacing w:after="20" w:before="20"/>
-              <w:jc w:val="center"/>
-            </w:pPr>
-            <w:r>
-              <w:rPr>
-                <w:rFonts w:ascii="Times New Roman" w:cs="Times New Roman" w:eastAsia="Times New Roman" w:hAnsi="Times New Roman"/>
-                <w:sz w:val="20"/>
-                <w:szCs w:val="20"/>
-              </w:rPr>
-              <w:t>n. c.</w:t>
-            </w:r>
-          </w:p>
-        </w:tc>
-        <w:tc>
-          <w:tcPr>
-            <w:tcW w:type="dxa" w:w="800"/>
-            <w:gridSpan w:val="1"/>
-            <w:tcBorders>
-              <w:top w:val="none" w:color="FFFFFF" w:sz="0"/>
-              <w:left w:val="none" w:color="FFFFFF" w:sz="0"/>
-              <w:bottom w:val="none" w:color="FFFFFF" w:sz="0"/>
-              <w:right w:val="none" w:color="FFFFFF" w:sz="0"/>
-            </w:tcBorders>
-            <w:tcMar>
-              <w:left w:type="dxa" w:w="60"/>
-              <w:right w:type="dxa" w:w="60"/>
-            </w:tcMar>
-          </w:tcPr>
-          <w:p>
-            <w:pPr>
-              <w:spacing w:after="20" w:before="20"/>
-              <w:jc w:val="center"/>
-            </w:pPr>
-            <w:r>
-              <w:rPr>
-                <w:rFonts w:ascii="Times New Roman" w:cs="Times New Roman" w:eastAsia="Times New Roman" w:hAnsi="Times New Roman"/>
-                <w:sz w:val="20"/>
-                <w:szCs w:val="20"/>
-              </w:rPr>
-              <w:t>—</w:t>
-            </w:r>
-          </w:p>
-        </w:tc>
-        <w:tc>
-          <w:tcPr>
-            <w:tcW w:type="dxa" w:w="1100"/>
-            <w:gridSpan w:val="1"/>
-            <w:tcBorders>
-              <w:top w:val="none" w:color="FFFFFF" w:sz="0"/>
-              <w:left w:val="none" w:color="FFFFFF" w:sz="0"/>
-              <w:bottom w:val="none" w:color="FFFFFF" w:sz="0"/>
-              <w:right w:val="none" w:color="FFFFFF" w:sz="0"/>
-            </w:tcBorders>
-            <w:tcMar>
-              <w:left w:type="dxa" w:w="60"/>
-              <w:right w:type="dxa" w:w="60"/>
-            </w:tcMar>
-          </w:tcPr>
-          <w:p>
-            <w:pPr>
-              <w:spacing w:after="20" w:before="20"/>
-              <w:jc w:val="center"/>
-            </w:pPr>
-            <w:r>
-              <w:rPr>
-                <w:rFonts w:ascii="Times New Roman" w:cs="Times New Roman" w:eastAsia="Times New Roman" w:hAnsi="Times New Roman"/>
-                <w:sz w:val="20"/>
-                <w:szCs w:val="20"/>
-              </w:rPr>
-              <w:t>n. c.</w:t>
-            </w:r>
-          </w:p>
-        </w:tc>
-        <w:tc>
-          <w:tcPr>
-            <w:tcW w:type="dxa" w:w="800"/>
-            <w:gridSpan w:val="1"/>
-            <w:tcBorders>
-              <w:top w:val="none" w:color="FFFFFF" w:sz="0"/>
-              <w:left w:val="none" w:color="FFFFFF" w:sz="0"/>
-              <w:bottom w:val="none" w:color="FFFFFF" w:sz="0"/>
-              <w:right w:val="none" w:color="FFFFFF" w:sz="0"/>
-            </w:tcBorders>
-            <w:tcMar>
-              <w:left w:type="dxa" w:w="60"/>
-              <w:right w:type="dxa" w:w="60"/>
-            </w:tcMar>
-          </w:tcPr>
-          <w:p>
-            <w:pPr>
-              <w:spacing w:after="20" w:before="20"/>
-              <w:jc w:val="center"/>
-            </w:pPr>
-            <w:r>
-              <w:rPr>
-                <w:rFonts w:ascii="Times New Roman" w:cs="Times New Roman" w:eastAsia="Times New Roman" w:hAnsi="Times New Roman"/>
-                <w:sz w:val="20"/>
-                <w:szCs w:val="20"/>
-              </w:rPr>
-              <w:t>—</w:t>
             </w:r>
           </w:p>
         </w:tc>
@@ -4280,7 +3728,7 @@
           <w:sz w:val="20"/>
           <w:szCs w:val="20"/>
         </w:rPr>
-        <w:t>Expedientes con sentencia de vista que declara la NULIDAD (se excluyen las revocadas): 53 del período Tradicional (2018) y 52 del período Oralidad (2024), que representan el 86,9 % de las 61 y el 78,8 % de las 66 sentencias anuladas del universo. Los bloques I y III cuentan las causales con estatus DECLARADO por la Sala; un expediente puede registrar varias, por lo que esas filas no suman 100 ni pueden agregarse por bloque. En el Bloque II, las filas a) a f) registran el supuesto principal de la STC 00728-2008-PHC/TC (caso Llamoja), una sola categoría por expediente; las 14 (26,4 %) y 17 (32,7 %) sentencias restantes se anularon por vicio procesal sin defecto de motivación. Las subfilas «de ello» cuentan, dentro de cada supuesto principal, los expedientes que además registran la causal indicada, y no se suman a él. En el Bloque III, por tratarse de sentencias anuladas, se consigna el error de juicio que la Sala invocó para anular; la calificación jurídica, la pericia y la omisión de regla vinculante de Pleno Casatorio no están codificadas en el catálogo D01–D23 (n. c.). El bloque «Resultado del control» se calcula sobre el universo de sentencias de cada período. Fuente: Corpus_unificado_CORREGIDO_SV_CSJA_2_TOTAL_3_FIN.xlsx, Corpus_Llamoja_UNIFICADO.xlsx y reporte de sentencias por período (2018: 281; 2024: 328).</w:t>
+        <w:t>Expedientes con sentencia de vista que declara la NULIDAD (se excluyen las revocadas): 53 del período Tradicional (2018) y 52 del período Oralidad (2024), que representan el 86,9 % de las 61 y el 78,8 % de las 66 sentencias anuladas del universo. Los bloques I y III cuentan las causales con estatus DECLARADO por la Sala; un expediente puede registrar varias, por lo que esas filas no suman 100 ni pueden agregarse por bloque. En el Bloque II, las filas a) a f) registran el supuesto principal de la STC 00728-2008-PHC/TC (caso Llamoja), una sola categoría por expediente; las 14 (26,4 %) y 17 (32,7 %) sentencias restantes se anularon por vicio procesal sin defecto de motivación. Las subfilas «de ello» cuentan, dentro de cada supuesto principal, los expedientes que además registran la causal indicada, y no se suman a él. En el Bloque III, por tratarse de sentencias anuladas, se consigna el error de juicio que la Sala invocó para anular. El bloque «Resultado del control» se calcula sobre el universo de sentencias de cada período. Fuente: Corpus_unificado_CORREGIDO_SV_CSJA_2_TOTAL_3_FIN.xlsx, Corpus_Llamoja_UNIFICADO.xlsx y reporte de sentencias por período (2018: 281; 2024: 328).</w:t>
       </w:r>
     </w:p>
     <w:p>

</xml_diff>